<commit_message>
Field Consultation removed; Review & Reflection is worth 30
The consultation's 5 points move to Review & Reflection, so the course
total stays 350. The R&R rubric is now 15 for the revision and 15 for how
the reads shaped the paper. The course home, README, review page and
syllabus drop the consultation, and the Week 11 handout is deleted.

The syllabus PDF is rebuilt from the .docx, which also brings in the
September genAI planning partner wording it had missed.

Co-Authored-By: Claude Opus 5.5 <noreply@anthropic.com>
</commit_message>
<xml_diff>
--- a/TCE-318P-Fall-2026-Syllabus.docx
+++ b/TCE-318P-Fall-2026-Syllabus.docx
@@ -2285,29 +2285,29 @@
               <w:pStyle w:val="Compact"/>
             </w:pPr>
             <w:r>
-              <w:t xml:space="preserve">Field Consultation</w:t>
-            </w:r>
-          </w:p>
-        </w:tc>
-        <w:tc>
-          <w:tcPr/>
-          <w:p>
-            <w:pPr>
-              <w:pStyle w:val="Compact"/>
-            </w:pPr>
-            <w:r>
-              <w:t xml:space="preserve">Sun Nov 15</w:t>
-            </w:r>
-          </w:p>
-        </w:tc>
-        <w:tc>
-          <w:tcPr/>
-          <w:p>
-            <w:pPr>
-              <w:pStyle w:val="Compact"/>
-            </w:pPr>
-            <w:r>
-              <w:t xml:space="preserve">Sun Nov 15</w:t>
+              <w:t xml:space="preserve">Final Report</w:t>
+            </w:r>
+          </w:p>
+        </w:tc>
+        <w:tc>
+          <w:tcPr/>
+          <w:p>
+            <w:pPr>
+              <w:pStyle w:val="Compact"/>
+            </w:pPr>
+            <w:r>
+              <w:t xml:space="preserve">Wed Dec 9</w:t>
+            </w:r>
+          </w:p>
+        </w:tc>
+        <w:tc>
+          <w:tcPr/>
+          <w:p>
+            <w:pPr>
+              <w:pStyle w:val="Compact"/>
+            </w:pPr>
+            <w:r>
+              <w:t xml:space="preserve">Wed Dec 9</w:t>
             </w:r>
           </w:p>
         </w:tc>
@@ -2319,20 +2319,20 @@
               <w:jc w:val="right"/>
             </w:pPr>
             <w:r>
-              <w:t xml:space="preserve">5</w:t>
-            </w:r>
-          </w:p>
-        </w:tc>
-      </w:tr>
-      <w:tr>
-        <w:tc>
-          <w:tcPr/>
-          <w:p>
-            <w:pPr>
-              <w:pStyle w:val="Compact"/>
-            </w:pPr>
-            <w:r>
-              <w:t xml:space="preserve">Final Report</w:t>
+              <w:t xml:space="preserve">50</w:t>
+            </w:r>
+          </w:p>
+        </w:tc>
+      </w:tr>
+      <w:tr>
+        <w:tc>
+          <w:tcPr/>
+          <w:p>
+            <w:pPr>
+              <w:pStyle w:val="Compact"/>
+            </w:pPr>
+            <w:r>
+              <w:t xml:space="preserve">Review &amp; Reflection</w:t>
             </w:r>
           </w:p>
         </w:tc>
@@ -2366,54 +2366,7 @@
               <w:jc w:val="right"/>
             </w:pPr>
             <w:r>
-              <w:t xml:space="preserve">50</w:t>
-            </w:r>
-          </w:p>
-        </w:tc>
-      </w:tr>
-      <w:tr>
-        <w:tc>
-          <w:tcPr/>
-          <w:p>
-            <w:pPr>
-              <w:pStyle w:val="Compact"/>
-            </w:pPr>
-            <w:r>
-              <w:t xml:space="preserve">Review &amp; Reflection</w:t>
-            </w:r>
-          </w:p>
-        </w:tc>
-        <w:tc>
-          <w:tcPr/>
-          <w:p>
-            <w:pPr>
-              <w:pStyle w:val="Compact"/>
-            </w:pPr>
-            <w:r>
-              <w:t xml:space="preserve">Wed Dec 9</w:t>
-            </w:r>
-          </w:p>
-        </w:tc>
-        <w:tc>
-          <w:tcPr/>
-          <w:p>
-            <w:pPr>
-              <w:pStyle w:val="Compact"/>
-            </w:pPr>
-            <w:r>
-              <w:t xml:space="preserve">Wed Dec 9</w:t>
-            </w:r>
-          </w:p>
-        </w:tc>
-        <w:tc>
-          <w:tcPr/>
-          <w:p>
-            <w:pPr>
-              <w:pStyle w:val="Compact"/>
-              <w:jc w:val="right"/>
-            </w:pPr>
-            <w:r>
-              <w:t xml:space="preserve">25</w:t>
+              <w:t>30</w:t>
             </w:r>
           </w:p>
         </w:tc>

</xml_diff>